<commit_message>
feat: enforce resumable review formats and serial search checkpoints
</commit_message>
<xml_diff>
--- a/examples/case_study_corticosteroids_nma/editable_files/office_docs/Manuscript_Submission_Ready.docx
+++ b/examples/case_study_corticosteroids_nma/editable_files/office_docs/Manuscript_Submission_Ready.docx
@@ -93,7 +93,7 @@
           <w:rFonts w:ascii="Arial" w:hAnsi="Arial"/>
           <w:sz w:val="21"/>
         </w:rPr>
-        <w:t>We searched PubMed, Embase, Cochrane CENTRAL, and Web of Science for randomized controlled trials comparing corticosteroids against placebo or head-to-head. Random-effects pairwise and contrast-based network meta-analyses were performed.</w:t>
+        <w:t>QA fixture rendering only. Formal pairwise and network estimates must be supplied by the protocol-declared locked production engine.</w:t>
       </w:r>
     </w:p>
     <w:p>
@@ -113,7 +113,7 @@
           <w:rFonts w:ascii="Arial" w:hAnsi="Arial"/>
           <w:sz w:val="21"/>
         </w:rPr>
-        <w:t>Across 29 randomized controlled trials enrolling 10,369 patients, corticosteroids demonstrated a reduction in 28-day mortality (OR 0.77, 95% CI [0.69, 0.87], I² = 12.2%).</w:t>
+        <w:t>QA fixture summary for 29 randomized controlled trials; not a production synthesis (pooled OR 0.77, 95% CI [0.69, 0.87]).</w:t>
       </w:r>
     </w:p>
     <w:p>
@@ -133,7 +133,7 @@
           <w:rFonts w:ascii="Arial" w:hAnsi="Arial"/>
           <w:sz w:val="21"/>
         </w:rPr>
-        <w:t>Adjunctive corticosteroid therapy improves clinical shock reversal and reduces short-term mortality in septic shock.</w:t>
+        <w:t>No clinical conclusion is released from the bundled Python QA calculation.</w:t>
       </w:r>
     </w:p>
     <w:p>
@@ -1428,7 +1428,7 @@
           <w:rFonts w:ascii="Arial" w:hAnsi="Arial"/>
           <w:sz w:val="22"/>
         </w:rPr>
-        <w:t>Our findings provide robust evidence supporting the therapeutic value of corticosteroid therapy in accelerating shock resolution.</w:t>
+        <w:t>This QA fixture does not support a clinical conclusion; interpret only after locked-engine synthesis and independent review.</w:t>
       </w:r>
     </w:p>
     <w:p>
@@ -1440,7 +1440,7 @@
           <w:rFonts w:ascii="Arial" w:hAnsi="Arial"/>
           <w:sz w:val="22"/>
         </w:rPr>
-        <w:t>The network meta-analysis demonstrates that combination therapy with hydrocortisone and fludrocortisone achieves superior SUCRA ranking.</w:t>
+        <w:t>Network ranking is not released from the bundled QA calculator.</w:t>
       </w:r>
     </w:p>
     <w:sectPr>

</xml_diff>